<commit_message>
Actualizar diseño TO-BE del Reto 2
</commit_message>
<xml_diff>
--- a/Reto 2/1-Puntos-de-Dolor/puntos de dolor.docx
+++ b/Reto 2/1-Puntos-de-Dolor/puntos de dolor.docx
@@ -30,6 +30,7 @@
         <w:gridCol w:w="987"/>
         <w:gridCol w:w="1863"/>
         <w:gridCol w:w="1644"/>
+        <w:gridCol w:w="2304"/>
       </w:tblGrid>
       <w:tr>
         <w:tc>
@@ -140,6 +141,16 @@
             </w:r>
           </w:p>
         </w:tc>
+        <w:tc>
+          <w:tcPr>
+            <w:tcW w:type="dxa" w:w="2304"/>
+          </w:tcPr>
+          <w:p>
+            <w:r>
+              <w:t>Dónde</w:t>
+            </w:r>
+          </w:p>
+        </w:tc>
       </w:tr>
       <w:tr>
         <w:tc>
@@ -162,17 +173,151 @@
             <w:vAlign w:val="center"/>
           </w:tcPr>
           <w:p>
+            <w:r>
+              <w:t>La búsqueda de productos está duplicada entre la consulta y la venta</w:t>
+            </w:r>
+          </w:p>
+        </w:tc>
+        <w:tc>
+          <w:tcPr>
+            <w:tcW w:w="1700" w:type="dxa"/>
+            <w:vAlign w:val="center"/>
+          </w:tcPr>
+          <w:p>
+            <w:r>
+              <w:t>2 archivos / 2 clases</w:t>
+            </w:r>
+          </w:p>
+        </w:tc>
+        <w:tc>
+          <w:tcPr>
+            <w:tcW w:w="900" w:type="dxa"/>
+            <w:vAlign w:val="center"/>
+          </w:tcPr>
+          <w:p>
+            <w:r>
+              <w:t>Media</w:t>
+            </w:r>
+          </w:p>
+        </w:tc>
+        <w:tc>
+          <w:tcPr>
+            <w:tcW w:w="1700" w:type="dxa"/>
+            <w:vAlign w:val="center"/>
+          </w:tcPr>
+          <w:p>
+            <w:r>
+              <w:t>Centralizar en ServicioProducto sin patrón</w:t>
+            </w:r>
+          </w:p>
+        </w:tc>
+        <w:tc>
+          <w:tcPr>
+            <w:tcW w:w="1500" w:type="dxa"/>
+            <w:vAlign w:val="center"/>
+          </w:tcPr>
+          <w:p>
+            <w:r>
+              <w:t>IA asistida</w:t>
+            </w:r>
+          </w:p>
+        </w:tc>
+        <w:tc>
+          <w:tcPr>
+            <w:tcW w:type="dxa" w:w="2304"/>
+          </w:tcPr>
+          <w:p>
+            <w:r>
+              <w:t>Program.cs:273-278; ServicioVenta.cs:24-32</w:t>
+            </w:r>
+          </w:p>
+        </w:tc>
+      </w:tr>
+      <w:tr>
+        <w:tc>
+          <w:tcPr>
+            <w:tcW w:w="700" w:type="dxa"/>
+            <w:vAlign w:val="center"/>
+          </w:tcPr>
+          <w:p>
             <w:pPr>
               <w:spacing w:after="0"/>
             </w:pPr>
             <w:r>
-              <w:t>El formato de productos esta acoplado al orden posicional de sus columnas</w:t>
+              <w:t>P-02</w:t>
+            </w:r>
+          </w:p>
+        </w:tc>
+        <w:tc>
+          <w:tcPr>
+            <w:tcW w:w="3900" w:type="dxa"/>
+            <w:vAlign w:val="center"/>
+          </w:tcPr>
+          <w:p>
+            <w:r>
+              <w:t>La venta no admite políticas comerciales variables</w:t>
             </w:r>
           </w:p>
         </w:tc>
         <w:tc>
           <w:tcPr>
             <w:tcW w:w="1700" w:type="dxa"/>
+            <w:vAlign w:val="center"/>
+          </w:tcPr>
+          <w:p>
+            <w:r>
+              <w:t>4 archivos / 4 tipos</w:t>
+            </w:r>
+          </w:p>
+        </w:tc>
+        <w:tc>
+          <w:tcPr>
+            <w:tcW w:w="900" w:type="dxa"/>
+            <w:vAlign w:val="center"/>
+          </w:tcPr>
+          <w:p>
+            <w:r>
+              <w:t>Alta</w:t>
+            </w:r>
+          </w:p>
+        </w:tc>
+        <w:tc>
+          <w:tcPr>
+            <w:tcW w:w="1700" w:type="dxa"/>
+            <w:vAlign w:val="center"/>
+          </w:tcPr>
+          <w:p>
+            <w:r>
+              <w:t>Adoptar Strategy</w:t>
+            </w:r>
+          </w:p>
+        </w:tc>
+        <w:tc>
+          <w:tcPr>
+            <w:tcW w:w="1500" w:type="dxa"/>
+            <w:vAlign w:val="center"/>
+          </w:tcPr>
+          <w:p>
+            <w:r>
+              <w:t>Propio</w:t>
+            </w:r>
+          </w:p>
+        </w:tc>
+        <w:tc>
+          <w:tcPr>
+            <w:tcW w:type="dxa" w:w="2304"/>
+          </w:tcPr>
+          <w:p>
+            <w:r>
+              <w:t>ServicioVenta.cs; IDescuento.cs; ServicioDescuento.cs; Program.cs</w:t>
+            </w:r>
+          </w:p>
+        </w:tc>
+      </w:tr>
+      <w:tr>
+        <w:tc>
+          <w:tcPr>
+            <w:tcW w:w="700" w:type="dxa"/>
             <w:vAlign w:val="center"/>
           </w:tcPr>
           <w:p>
@@ -180,13 +325,80 @@
               <w:spacing w:after="0"/>
             </w:pPr>
             <w:r>
-              <w:t>3 archivos / 3 clases</w:t>
+              <w:t>P-03</w:t>
+            </w:r>
+          </w:p>
+        </w:tc>
+        <w:tc>
+          <w:tcPr>
+            <w:tcW w:w="3900" w:type="dxa"/>
+            <w:vAlign w:val="center"/>
+          </w:tcPr>
+          <w:p>
+            <w:r>
+              <w:t>Cada alerta nueva amplía detección, evento y composición</w:t>
+            </w:r>
+          </w:p>
+        </w:tc>
+        <w:tc>
+          <w:tcPr>
+            <w:tcW w:w="1700" w:type="dxa"/>
+            <w:vAlign w:val="center"/>
+          </w:tcPr>
+          <w:p>
+            <w:r>
+              <w:t>3 archivos / 3 clases por alerta</w:t>
             </w:r>
           </w:p>
         </w:tc>
         <w:tc>
           <w:tcPr>
             <w:tcW w:w="900" w:type="dxa"/>
+            <w:vAlign w:val="center"/>
+          </w:tcPr>
+          <w:p>
+            <w:r>
+              <w:t>Alta</w:t>
+            </w:r>
+          </w:p>
+        </w:tc>
+        <w:tc>
+          <w:tcPr>
+            <w:tcW w:w="1700" w:type="dxa"/>
+            <w:vAlign w:val="center"/>
+          </w:tcPr>
+          <w:p>
+            <w:r>
+              <w:t>Adoptar Composite</w:t>
+            </w:r>
+          </w:p>
+        </w:tc>
+        <w:tc>
+          <w:tcPr>
+            <w:tcW w:w="1500" w:type="dxa"/>
+            <w:vAlign w:val="center"/>
+          </w:tcPr>
+          <w:p>
+            <w:r>
+              <w:t>Propio</w:t>
+            </w:r>
+          </w:p>
+        </w:tc>
+        <w:tc>
+          <w:tcPr>
+            <w:tcW w:type="dxa" w:w="2304"/>
+          </w:tcPr>
+          <w:p>
+            <w:r>
+              <w:t>ServicioMonitoreoProductos.cs; eventos; Program.cs</w:t>
+            </w:r>
+          </w:p>
+        </w:tc>
+      </w:tr>
+      <w:tr>
+        <w:tc>
+          <w:tcPr>
+            <w:tcW w:w="700" w:type="dxa"/>
             <w:vAlign w:val="center"/>
           </w:tcPr>
           <w:p>
@@ -194,13 +406,80 @@
               <w:spacing w:after="0"/>
             </w:pPr>
             <w:r>
-              <w:t>Alta</w:t>
+              <w:t>P-04</w:t>
+            </w:r>
+          </w:p>
+        </w:tc>
+        <w:tc>
+          <w:tcPr>
+            <w:tcW w:w="3900" w:type="dxa"/>
+            <w:vAlign w:val="center"/>
+          </w:tcPr>
+          <w:p>
+            <w:r>
+              <w:t>El algoritmo de carga TXT está triplicado</w:t>
             </w:r>
           </w:p>
         </w:tc>
         <w:tc>
           <w:tcPr>
             <w:tcW w:w="1700" w:type="dxa"/>
+            <w:vAlign w:val="center"/>
+          </w:tcPr>
+          <w:p>
+            <w:r>
+              <w:t>3 archivos / 3 clases</w:t>
+            </w:r>
+          </w:p>
+        </w:tc>
+        <w:tc>
+          <w:tcPr>
+            <w:tcW w:w="900" w:type="dxa"/>
+            <w:vAlign w:val="center"/>
+          </w:tcPr>
+          <w:p>
+            <w:r>
+              <w:t>Media</w:t>
+            </w:r>
+          </w:p>
+        </w:tc>
+        <w:tc>
+          <w:tcPr>
+            <w:tcW w:w="1700" w:type="dxa"/>
+            <w:vAlign w:val="center"/>
+          </w:tcPr>
+          <w:p>
+            <w:r>
+              <w:t>Adoptar Template Method</w:t>
+            </w:r>
+          </w:p>
+        </w:tc>
+        <w:tc>
+          <w:tcPr>
+            <w:tcW w:w="1500" w:type="dxa"/>
+            <w:vAlign w:val="center"/>
+          </w:tcPr>
+          <w:p>
+            <w:r>
+              <w:t>Propio</w:t>
+            </w:r>
+          </w:p>
+        </w:tc>
+        <w:tc>
+          <w:tcPr>
+            <w:tcW w:type="dxa" w:w="2304"/>
+          </w:tcPr>
+          <w:p>
+            <w:r>
+              <w:t>CargadorProductosTxt.cs; CargadorClientesTxt.cs; CargadorUsuariosTxt.cs</w:t>
+            </w:r>
+          </w:p>
+        </w:tc>
+      </w:tr>
+      <w:tr>
+        <w:tc>
+          <w:tcPr>
+            <w:tcW w:w="700" w:type="dxa"/>
             <w:vAlign w:val="center"/>
           </w:tcPr>
           <w:p>
@@ -208,7 +487,51 @@
               <w:spacing w:after="0"/>
             </w:pPr>
             <w:r>
-              <w:t>Intervenir</w:t>
+              <w:t>P-05</w:t>
+            </w:r>
+          </w:p>
+        </w:tc>
+        <w:tc>
+          <w:tcPr>
+            <w:tcW w:w="3900" w:type="dxa"/>
+            <w:vAlign w:val="center"/>
+          </w:tcPr>
+          <w:p>
+            <w:r>
+              <w:t>El menú está centralizado en un switch</w:t>
+            </w:r>
+          </w:p>
+        </w:tc>
+        <w:tc>
+          <w:tcPr>
+            <w:tcW w:w="1700" w:type="dxa"/>
+            <w:vAlign w:val="center"/>
+          </w:tcPr>
+          <w:p>
+            <w:r>
+              <w:t>1 archivo / 1 clase implícita</w:t>
+            </w:r>
+          </w:p>
+        </w:tc>
+        <w:tc>
+          <w:tcPr>
+            <w:tcW w:w="900" w:type="dxa"/>
+            <w:vAlign w:val="center"/>
+          </w:tcPr>
+          <w:p>
+            <w:r>
+              <w:t>Baja</w:t>
+            </w:r>
+          </w:p>
+        </w:tc>
+        <w:tc>
+          <w:tcPr>
+            <w:tcW w:w="1700" w:type="dxa"/>
+            <w:vAlign w:val="center"/>
+          </w:tcPr>
+          <w:p>
+            <w:r>
+              <w:t>No intervenir; descartar Command</w:t>
             </w:r>
           </w:p>
         </w:tc>
@@ -218,355 +541,18 @@
             <w:vAlign w:val="center"/>
           </w:tcPr>
           <w:p>
-            <w:pPr>
-              <w:spacing w:after="0"/>
-            </w:pPr>
             <w:r>
               <w:t>Propio</w:t>
             </w:r>
           </w:p>
         </w:tc>
-      </w:tr>
-      <w:tr>
-        <w:tc>
-          <w:tcPr>
-            <w:tcW w:w="700" w:type="dxa"/>
-            <w:vAlign w:val="center"/>
-          </w:tcPr>
-          <w:p>
-            <w:pPr>
-              <w:spacing w:after="0"/>
-            </w:pPr>
-            <w:r>
-              <w:t>P-02</w:t>
-            </w:r>
-          </w:p>
-        </w:tc>
-        <w:tc>
-          <w:tcPr>
-            <w:tcW w:w="3900" w:type="dxa"/>
-            <w:vAlign w:val="center"/>
-          </w:tcPr>
-          <w:p>
-            <w:pPr>
-              <w:spacing w:after="0"/>
-            </w:pPr>
-            <w:r>
-              <w:t>La venta no admite politicas comerciales variables</w:t>
-            </w:r>
-          </w:p>
-        </w:tc>
-        <w:tc>
-          <w:tcPr>
-            <w:tcW w:w="1700" w:type="dxa"/>
-            <w:vAlign w:val="center"/>
-          </w:tcPr>
-          <w:p>
-            <w:pPr>
-              <w:spacing w:after="0"/>
-            </w:pPr>
-            <w:r>
-              <w:t>4 archivos / 4 clases</w:t>
-            </w:r>
-          </w:p>
-        </w:tc>
-        <w:tc>
-          <w:tcPr>
-            <w:tcW w:w="900" w:type="dxa"/>
-            <w:vAlign w:val="center"/>
-          </w:tcPr>
-          <w:p>
-            <w:pPr>
-              <w:spacing w:after="0"/>
-            </w:pPr>
-            <w:r>
-              <w:t>Alta</w:t>
-            </w:r>
-          </w:p>
-        </w:tc>
-        <w:tc>
-          <w:tcPr>
-            <w:tcW w:w="1700" w:type="dxa"/>
-            <w:vAlign w:val="center"/>
-          </w:tcPr>
-          <w:p>
-            <w:pPr>
-              <w:spacing w:after="0"/>
-            </w:pPr>
-            <w:r>
-              <w:t>Adoptar Strategy</w:t>
-            </w:r>
-          </w:p>
-        </w:tc>
-        <w:tc>
-          <w:tcPr>
-            <w:tcW w:w="1500" w:type="dxa"/>
-            <w:vAlign w:val="center"/>
-          </w:tcPr>
-          <w:p>
-            <w:pPr>
-              <w:spacing w:after="0"/>
-            </w:pPr>
-            <w:r>
-              <w:t>IA asistida</w:t>
-            </w:r>
-          </w:p>
-        </w:tc>
-      </w:tr>
-      <w:tr>
-        <w:tc>
-          <w:tcPr>
-            <w:tcW w:w="700" w:type="dxa"/>
-            <w:vAlign w:val="center"/>
-          </w:tcPr>
-          <w:p>
-            <w:pPr>
-              <w:spacing w:after="0"/>
-            </w:pPr>
-            <w:r>
-              <w:t>P-03</w:t>
-            </w:r>
-          </w:p>
-        </w:tc>
-        <w:tc>
-          <w:tcPr>
-            <w:tcW w:w="3900" w:type="dxa"/>
-            <w:vAlign w:val="center"/>
-          </w:tcPr>
-          <w:p>
-            <w:pPr>
-              <w:spacing w:after="0"/>
-            </w:pPr>
-            <w:r>
-              <w:t>Cada nueva alerta amplia deteccion, evento y composicion</w:t>
-            </w:r>
-          </w:p>
-        </w:tc>
-        <w:tc>
-          <w:tcPr>
-            <w:tcW w:w="1700" w:type="dxa"/>
-            <w:vAlign w:val="center"/>
-          </w:tcPr>
-          <w:p>
-            <w:pPr>
-              <w:spacing w:after="0"/>
-            </w:pPr>
-            <w:r>
-              <w:t>3 archivos / 3 clases por alerta</w:t>
-            </w:r>
-          </w:p>
-        </w:tc>
-        <w:tc>
-          <w:tcPr>
-            <w:tcW w:w="900" w:type="dxa"/>
-            <w:vAlign w:val="center"/>
-          </w:tcPr>
-          <w:p>
-            <w:pPr>
-              <w:spacing w:after="0"/>
-            </w:pPr>
-            <w:r>
-              <w:t>Alta</w:t>
-            </w:r>
-          </w:p>
-        </w:tc>
-        <w:tc>
-          <w:tcPr>
-            <w:tcW w:w="1700" w:type="dxa"/>
-            <w:vAlign w:val="center"/>
-          </w:tcPr>
-          <w:p>
-            <w:pPr>
-              <w:spacing w:after="0"/>
-            </w:pPr>
-            <w:r>
-              <w:t>Adoptar Composite</w:t>
-            </w:r>
-          </w:p>
-        </w:tc>
-        <w:tc>
-          <w:tcPr>
-            <w:tcW w:w="1500" w:type="dxa"/>
-            <w:vAlign w:val="center"/>
-          </w:tcPr>
-          <w:p>
-            <w:pPr>
-              <w:spacing w:after="0"/>
-            </w:pPr>
-            <w:r>
-              <w:t>IA asistida</w:t>
-            </w:r>
-          </w:p>
-        </w:tc>
-      </w:tr>
-      <w:tr>
-        <w:tc>
-          <w:tcPr>
-            <w:tcW w:w="700" w:type="dxa"/>
-            <w:vAlign w:val="center"/>
-          </w:tcPr>
-          <w:p>
-            <w:pPr>
-              <w:spacing w:after="0"/>
-            </w:pPr>
-            <w:r>
-              <w:t>P-04</w:t>
-            </w:r>
-          </w:p>
-        </w:tc>
-        <w:tc>
-          <w:tcPr>
-            <w:tcW w:w="3900" w:type="dxa"/>
-            <w:vAlign w:val="center"/>
-          </w:tcPr>
-          <w:p>
-            <w:pPr>
-              <w:spacing w:after="0"/>
-            </w:pPr>
-            <w:r>
-              <w:t>El algoritmo de carga TXT esta triplicado</w:t>
-            </w:r>
-          </w:p>
-        </w:tc>
-        <w:tc>
-          <w:tcPr>
-            <w:tcW w:w="1700" w:type="dxa"/>
-            <w:vAlign w:val="center"/>
-          </w:tcPr>
-          <w:p>
-            <w:pPr>
-              <w:spacing w:after="0"/>
-            </w:pPr>
-            <w:r>
-              <w:t>3 archivos / 3 clases</w:t>
-            </w:r>
-          </w:p>
-        </w:tc>
-        <w:tc>
-          <w:tcPr>
-            <w:tcW w:w="900" w:type="dxa"/>
-            <w:vAlign w:val="center"/>
-          </w:tcPr>
-          <w:p>
-            <w:pPr>
-              <w:spacing w:after="0"/>
-            </w:pPr>
-            <w:r>
-              <w:t>Media</w:t>
-            </w:r>
-          </w:p>
-        </w:tc>
-        <w:tc>
-          <w:tcPr>
-            <w:tcW w:w="1700" w:type="dxa"/>
-            <w:vAlign w:val="center"/>
-          </w:tcPr>
-          <w:p>
-            <w:pPr>
-              <w:spacing w:after="0"/>
-            </w:pPr>
-            <w:r>
-              <w:t>Adoptar Template Method</w:t>
-            </w:r>
-          </w:p>
-        </w:tc>
-        <w:tc>
-          <w:tcPr>
-            <w:tcW w:w="1500" w:type="dxa"/>
-            <w:vAlign w:val="center"/>
-          </w:tcPr>
-          <w:p>
-            <w:pPr>
-              <w:spacing w:after="0"/>
-            </w:pPr>
-            <w:r>
-              <w:t>IA asistida</w:t>
-            </w:r>
-          </w:p>
-        </w:tc>
-      </w:tr>
-      <w:tr>
-        <w:tc>
-          <w:tcPr>
-            <w:tcW w:w="700" w:type="dxa"/>
-            <w:vAlign w:val="center"/>
-          </w:tcPr>
-          <w:p>
-            <w:pPr>
-              <w:spacing w:after="0"/>
-            </w:pPr>
-            <w:r>
-              <w:t>P-05</w:t>
-            </w:r>
-          </w:p>
-        </w:tc>
-        <w:tc>
-          <w:tcPr>
-            <w:tcW w:w="3900" w:type="dxa"/>
-            <w:vAlign w:val="center"/>
-          </w:tcPr>
-          <w:p>
-            <w:pPr>
-              <w:spacing w:after="0"/>
-            </w:pPr>
-            <w:r>
-              <w:t>El menu esta centralizado en un switch</w:t>
-            </w:r>
-          </w:p>
-        </w:tc>
-        <w:tc>
-          <w:tcPr>
-            <w:tcW w:w="1700" w:type="dxa"/>
-            <w:vAlign w:val="center"/>
-          </w:tcPr>
-          <w:p>
-            <w:pPr>
-              <w:spacing w:after="0"/>
-            </w:pPr>
-            <w:r>
-              <w:t>1 archivo / 1 clase implicita</w:t>
-            </w:r>
-          </w:p>
-        </w:tc>
-        <w:tc>
-          <w:tcPr>
-            <w:tcW w:w="900" w:type="dxa"/>
-            <w:vAlign w:val="center"/>
-          </w:tcPr>
-          <w:p>
-            <w:pPr>
-              <w:spacing w:after="0"/>
-            </w:pPr>
-            <w:r>
-              <w:t>Baja</w:t>
-            </w:r>
-          </w:p>
-        </w:tc>
-        <w:tc>
-          <w:tcPr>
-            <w:tcW w:w="1700" w:type="dxa"/>
-            <w:vAlign w:val="center"/>
-          </w:tcPr>
-          <w:p>
-            <w:pPr>
-              <w:spacing w:after="0"/>
-            </w:pPr>
-            <w:r>
-              <w:t>No intervenir; descartar Command</w:t>
-            </w:r>
-          </w:p>
-        </w:tc>
-        <w:tc>
-          <w:tcPr>
-            <w:tcW w:w="1500" w:type="dxa"/>
-            <w:vAlign w:val="center"/>
-          </w:tcPr>
-          <w:p>
-            <w:pPr>
-              <w:spacing w:after="0"/>
-            </w:pPr>
-            <w:r>
-              <w:t>IA asistida</w:t>
+        <w:tc>
+          <w:tcPr>
+            <w:tcW w:type="dxa" w:w="2304"/>
+          </w:tcPr>
+          <w:p>
+            <w:r>
+              <w:t>Program.cs:203-413</w:t>
             </w:r>
           </w:p>
         </w:tc>

</xml_diff>